<commit_message>
some edits to scripts, added data informaiton to README
</commit_message>
<xml_diff>
--- a/README.docx
+++ b/README.docx
@@ -21,191 +21,850 @@
           <w:bCs/>
           <w:u w:val="single"/>
         </w:rPr>
-        <w:t xml:space="preserve">Script files in </w:t>
+        <w:t>Script files</w:t>
+      </w:r>
+    </w:p>
+    <w:p>
+      <w:r>
+        <w:t>1_Data_Cleaning</w:t>
+      </w:r>
+      <w:r>
+        <w:t xml:space="preserve">.R: This file has </w:t>
+      </w:r>
+      <w:proofErr w:type="gramStart"/>
+      <w:r>
+        <w:t>all of</w:t>
+      </w:r>
+      <w:proofErr w:type="gramEnd"/>
+      <w:r>
+        <w:t xml:space="preserve"> the fixes to the data which were recorded in my lab notebook, issues with samples which were redone on a new plate etc. It also has the contamination correction in which I filter for the negative controls. This step is separated by year because 2024 (barcoding) and 2025 (metabarcoding) had different control plate set ups. </w:t>
+      </w:r>
+    </w:p>
+    <w:p>
+      <w:r>
+        <w:t>2_</w:t>
+      </w:r>
+      <w:r>
+        <w:t>Functions</w:t>
+      </w:r>
+      <w:r>
+        <w:t xml:space="preserve">.R: Has </w:t>
+      </w:r>
+      <w:proofErr w:type="gramStart"/>
+      <w:r>
+        <w:t>all of</w:t>
+      </w:r>
+      <w:proofErr w:type="gramEnd"/>
+      <w:r>
+        <w:t xml:space="preserve"> the functions needed for analysis in </w:t>
+      </w:r>
+      <w:proofErr w:type="gramStart"/>
+      <w:r>
+        <w:t>all of</w:t>
+      </w:r>
+      <w:proofErr w:type="gramEnd"/>
+      <w:r>
+        <w:t xml:space="preserve"> the subsequent scripts. </w:t>
+      </w:r>
+    </w:p>
+    <w:p>
+      <w:r>
+        <w:t>3_</w:t>
+      </w:r>
+      <w:r>
+        <w:t>Phlygenetic_Analysis_Mediod_2024</w:t>
+      </w:r>
+      <w:r>
+        <w:t>.R: This is the phylogenetic analysis (the building of tree and species assignments of ones which we did not assign using the probabilistic method) for 2024 samples. THIS USES THE MEDIOD METHOD.</w:t>
+      </w:r>
+    </w:p>
+    <w:p>
+      <w:r>
+        <w:t>4</w:t>
+      </w:r>
+      <w:r>
+        <w:t>_Phlygenetic_Analysis_Mediod</w:t>
+      </w:r>
+      <w:r>
+        <w:t>_2025</w:t>
+      </w:r>
+      <w:r>
+        <w:t xml:space="preserve">.R: </w:t>
+      </w:r>
+      <w:r>
+        <w:t xml:space="preserve">This is the phylogenetic analysis (the building of tree and species assignments of ones which we </w:t>
+      </w:r>
+      <w:r>
+        <w:t>did not assign</w:t>
+      </w:r>
+      <w:r>
+        <w:t xml:space="preserve"> using the probabilistic method) for 202</w:t>
+      </w:r>
+      <w:r>
+        <w:t>5</w:t>
+      </w:r>
+      <w:r>
+        <w:t xml:space="preserve"> samples. THIS USES THE MEDIOD METHOD.</w:t>
+      </w:r>
+    </w:p>
+    <w:p>
+      <w:r>
+        <w:t>5_</w:t>
+      </w:r>
+      <w:r>
+        <w:t>Phylogenetic_Analysis_UniqueSequences</w:t>
+      </w:r>
+      <w:r>
+        <w:t xml:space="preserve">.R: </w:t>
+      </w:r>
+      <w:r>
+        <w:t xml:space="preserve">This is the phylogenetic analysis (the building of tree and species assignments of ones which we </w:t>
+      </w:r>
+      <w:r>
+        <w:t>did not assign</w:t>
+      </w:r>
+      <w:r>
+        <w:t xml:space="preserve"> using the probabilistic method) for </w:t>
+      </w:r>
+      <w:r>
+        <w:t xml:space="preserve">2024 and </w:t>
+      </w:r>
+      <w:r>
+        <w:t>2025 samples</w:t>
+      </w:r>
+      <w:r>
+        <w:t xml:space="preserve"> combined</w:t>
+      </w:r>
+      <w:r>
+        <w:t>.</w:t>
+      </w:r>
+      <w:r>
+        <w:t xml:space="preserve"> This uses unique sequences and has the BOLD files downloaded then brought into R. It also has the comparison of the two methods (from 3 and 4 above). </w:t>
+      </w:r>
+    </w:p>
+    <w:p>
+      <w:r>
+        <w:t>6_Ecological</w:t>
+      </w:r>
+      <w:r>
+        <w:t>_Analysis</w:t>
+      </w:r>
+      <w:r>
+        <w:t xml:space="preserve">.R: This has all the ecological analyses and most of the figure production. It has </w:t>
       </w:r>
       <w:proofErr w:type="spellStart"/>
       <w:r>
+        <w:t>iNEXT</w:t>
+      </w:r>
+      <w:proofErr w:type="spellEnd"/>
+      <w:r>
+        <w:t xml:space="preserve">, comparison with 2012 data, species richness, NMDS, </w:t>
+      </w:r>
+      <w:proofErr w:type="spellStart"/>
+      <w:r>
+        <w:t>gbif</w:t>
+      </w:r>
+      <w:proofErr w:type="spellEnd"/>
+      <w:r>
+        <w:t xml:space="preserve"> map production, sample map production, temperature comparison plot. Sections are separated and labeled accordingly. </w:t>
+      </w:r>
+    </w:p>
+    <w:p>
+      <w:pPr>
         <w:rPr>
           <w:b/>
           <w:bCs/>
           <w:u w:val="single"/>
         </w:rPr>
-        <w:t>Source_files</w:t>
-      </w:r>
-      <w:proofErr w:type="spellEnd"/>
+      </w:pPr>
       <w:r>
         <w:rPr>
           <w:b/>
           <w:bCs/>
           <w:u w:val="single"/>
         </w:rPr>
-        <w:t xml:space="preserve"> folder</w:t>
-      </w:r>
-    </w:p>
-    <w:p>
-      <w:r>
-        <w:t>1-</w:t>
+        <w:t>Data</w:t>
+      </w:r>
+    </w:p>
+    <w:p>
+      <w:pPr>
+        <w:rPr>
+          <w:u w:val="single"/>
+        </w:rPr>
+      </w:pPr>
+      <w:r>
+        <w:rPr>
+          <w:u w:val="single"/>
+        </w:rPr>
+        <w:t>Raw-data2: Has all the raw data needed in analysis</w:t>
+      </w:r>
+    </w:p>
+    <w:p>
+      <w:pPr>
+        <w:spacing w:after="0"/>
+      </w:pPr>
+      <w:r>
+        <w:t>Three files of 2024 sequence data:</w:t>
+      </w:r>
+    </w:p>
+    <w:p>
+      <w:pPr>
+        <w:spacing w:after="0" w:line="240" w:lineRule="auto"/>
+        <w:rPr>
+          <w:i/>
+          <w:iCs/>
+        </w:rPr>
+      </w:pPr>
+      <w:r>
+        <w:rPr>
+          <w:i/>
+          <w:iCs/>
+        </w:rPr>
+        <w:t>KGLKTK_2024_OTUDetails.tsv</w:t>
+      </w:r>
+    </w:p>
+    <w:p>
+      <w:pPr>
+        <w:spacing w:after="0" w:line="240" w:lineRule="auto"/>
+        <w:rPr>
+          <w:i/>
+          <w:iCs/>
+        </w:rPr>
+      </w:pPr>
+      <w:r>
+        <w:rPr>
+          <w:i/>
+          <w:iCs/>
+        </w:rPr>
+        <w:t>CBAY2024_AllPlates_OTUDetails.tsv</w:t>
+      </w:r>
+      <w:r>
+        <w:rPr>
+          <w:i/>
+          <w:iCs/>
+        </w:rPr>
+        <w:t xml:space="preserve"> </w:t>
+      </w:r>
+      <w:r>
+        <w:rPr>
+          <w:i/>
+          <w:iCs/>
+        </w:rPr>
+        <w:t xml:space="preserve">(and the corresponding </w:t>
+      </w:r>
+      <w:r>
+        <w:rPr>
+          <w:i/>
+          <w:iCs/>
+        </w:rPr>
+        <w:t>problemsamples.csv</w:t>
+      </w:r>
+      <w:r>
+        <w:rPr>
+          <w:i/>
+          <w:iCs/>
+        </w:rPr>
+        <w:t xml:space="preserve"> which outlines issues from lab notes)</w:t>
+      </w:r>
+    </w:p>
+    <w:p>
+      <w:pPr>
+        <w:spacing w:after="0" w:line="240" w:lineRule="auto"/>
+        <w:rPr>
+          <w:i/>
+          <w:iCs/>
+        </w:rPr>
+      </w:pPr>
+      <w:r>
+        <w:rPr>
+          <w:i/>
+          <w:iCs/>
+        </w:rPr>
+        <w:t>Shauna_CBAY2024_Plate3_OTUDetails.tsv</w:t>
+      </w:r>
+      <w:r>
+        <w:rPr>
+          <w:i/>
+          <w:iCs/>
+        </w:rPr>
+        <w:t xml:space="preserve"> </w:t>
+      </w:r>
+    </w:p>
+    <w:p>
+      <w:pPr>
+        <w:spacing w:after="0" w:line="240" w:lineRule="auto"/>
+      </w:pPr>
+    </w:p>
+    <w:p>
+      <w:pPr>
+        <w:spacing w:after="0" w:line="240" w:lineRule="auto"/>
+      </w:pPr>
+      <w:r>
+        <w:t>2025 sequence data file:</w:t>
+      </w:r>
+    </w:p>
+    <w:p>
+      <w:pPr>
+        <w:spacing w:after="0" w:line="240" w:lineRule="auto"/>
+        <w:rPr>
+          <w:i/>
+          <w:iCs/>
+        </w:rPr>
+      </w:pPr>
+      <w:r>
+        <w:rPr>
+          <w:i/>
+          <w:iCs/>
+        </w:rPr>
+        <w:t>KBIMP2025_insectCOI_OTUDetails.tsv</w:t>
+      </w:r>
+      <w:r>
+        <w:rPr>
+          <w:i/>
+          <w:iCs/>
+        </w:rPr>
+        <w:t xml:space="preserve"> (and the corresponding control data- </w:t>
+      </w:r>
+      <w:r>
+        <w:rPr>
+          <w:i/>
+          <w:iCs/>
+        </w:rPr>
+        <w:t>extractiondata2025.csv</w:t>
+      </w:r>
+      <w:r>
+        <w:rPr>
+          <w:i/>
+          <w:iCs/>
+        </w:rPr>
+        <w:t xml:space="preserve">, </w:t>
+      </w:r>
+      <w:r>
+        <w:rPr>
+          <w:i/>
+          <w:iCs/>
+        </w:rPr>
+        <w:t>PCRcontrol_data.csv</w:t>
+      </w:r>
+      <w:r>
+        <w:rPr>
+          <w:i/>
+          <w:iCs/>
+        </w:rPr>
+        <w:t>)</w:t>
+      </w:r>
+    </w:p>
+    <w:p>
+      <w:pPr>
+        <w:spacing w:after="0" w:line="240" w:lineRule="auto"/>
+      </w:pPr>
+      <w:r>
+        <w:lastRenderedPageBreak/>
+        <w:t>Outgroup sequence file:</w:t>
+      </w:r>
+    </w:p>
+    <w:p>
+      <w:pPr>
+        <w:spacing w:after="0" w:line="240" w:lineRule="auto"/>
+        <w:rPr>
+          <w:i/>
+          <w:iCs/>
+        </w:rPr>
+      </w:pPr>
+      <w:r>
+        <w:rPr>
+          <w:i/>
+          <w:iCs/>
+        </w:rPr>
+        <w:t>Outgroup.csv</w:t>
+      </w:r>
+    </w:p>
+    <w:p>
+      <w:pPr>
+        <w:spacing w:after="0" w:line="240" w:lineRule="auto"/>
+        <w:rPr>
+          <w:i/>
+          <w:iCs/>
+        </w:rPr>
+      </w:pPr>
+    </w:p>
+    <w:p>
+      <w:pPr>
+        <w:spacing w:after="0" w:line="240" w:lineRule="auto"/>
+      </w:pPr>
+      <w:r>
+        <w:t>Metadata files:</w:t>
+      </w:r>
+    </w:p>
+    <w:p>
+      <w:pPr>
+        <w:spacing w:after="0" w:line="240" w:lineRule="auto"/>
+        <w:rPr>
+          <w:i/>
+          <w:iCs/>
+        </w:rPr>
+      </w:pPr>
+      <w:r>
+        <w:rPr>
+          <w:i/>
+          <w:iCs/>
+        </w:rPr>
+        <w:t>CBAY2025_metadata.csv</w:t>
+      </w:r>
+    </w:p>
+    <w:p>
+      <w:pPr>
+        <w:spacing w:after="0" w:line="240" w:lineRule="auto"/>
+        <w:rPr>
+          <w:i/>
+          <w:iCs/>
+        </w:rPr>
+      </w:pPr>
+      <w:r>
+        <w:rPr>
+          <w:i/>
+          <w:iCs/>
+        </w:rPr>
+        <w:t>KGLTK2025_metadata.csv</w:t>
+      </w:r>
+    </w:p>
+    <w:p>
+      <w:pPr>
+        <w:spacing w:after="0" w:line="240" w:lineRule="auto"/>
+        <w:rPr>
+          <w:i/>
+          <w:iCs/>
+        </w:rPr>
+      </w:pPr>
+      <w:r>
+        <w:rPr>
+          <w:i/>
+          <w:iCs/>
+        </w:rPr>
+        <w:t>condencedsites.csv</w:t>
+      </w:r>
+    </w:p>
+    <w:p>
+      <w:pPr>
+        <w:spacing w:after="0" w:line="240" w:lineRule="auto"/>
+        <w:rPr>
+          <w:i/>
+          <w:iCs/>
+        </w:rPr>
+      </w:pPr>
+      <w:r>
+        <w:rPr>
+          <w:i/>
+          <w:iCs/>
+        </w:rPr>
+        <w:t>KBIMP2024_specimendata.csv</w:t>
+      </w:r>
+    </w:p>
+    <w:p>
+      <w:pPr>
+        <w:spacing w:after="0" w:line="240" w:lineRule="auto"/>
+        <w:rPr>
+          <w:i/>
+          <w:iCs/>
+        </w:rPr>
+      </w:pPr>
+      <w:r>
+        <w:rPr>
+          <w:i/>
+          <w:iCs/>
+        </w:rPr>
+        <w:t>KBIMP_meta_sitenamesfixed.csv</w:t>
+      </w:r>
+    </w:p>
+    <w:p>
+      <w:pPr>
+        <w:spacing w:after="0" w:line="240" w:lineRule="auto"/>
+        <w:rPr>
+          <w:i/>
+          <w:iCs/>
+        </w:rPr>
+      </w:pPr>
+      <w:r>
+        <w:rPr>
+          <w:i/>
+          <w:iCs/>
+        </w:rPr>
+        <w:t>KBIMP2024_abundence.csv</w:t>
+      </w:r>
+    </w:p>
+    <w:p>
+      <w:pPr>
+        <w:spacing w:after="0" w:line="240" w:lineRule="auto"/>
+        <w:rPr>
+          <w:i/>
+          <w:iCs/>
+        </w:rPr>
+      </w:pPr>
+      <w:r>
+        <w:rPr>
+          <w:i/>
+          <w:iCs/>
+        </w:rPr>
+        <w:t>vector_change.csv</w:t>
+      </w:r>
+    </w:p>
+    <w:p>
+      <w:pPr>
+        <w:spacing w:after="0" w:line="240" w:lineRule="auto"/>
+        <w:rPr>
+          <w:i/>
+          <w:iCs/>
+        </w:rPr>
+      </w:pPr>
+    </w:p>
+    <w:p>
+      <w:pPr>
+        <w:spacing w:after="0" w:line="240" w:lineRule="auto"/>
+      </w:pPr>
+      <w:r>
+        <w:t>The 2012 data file</w:t>
+      </w:r>
+    </w:p>
+    <w:p>
+      <w:pPr>
+        <w:spacing w:after="0" w:line="240" w:lineRule="auto"/>
+        <w:rPr>
+          <w:i/>
+          <w:iCs/>
+        </w:rPr>
+      </w:pPr>
+      <w:r>
+        <w:rPr>
+          <w:i/>
+          <w:iCs/>
+        </w:rPr>
+        <w:t>schafer_2012.csv</w:t>
+      </w:r>
+    </w:p>
+    <w:p>
+      <w:pPr>
+        <w:spacing w:after="0" w:line="240" w:lineRule="auto"/>
+        <w:rPr>
+          <w:i/>
+          <w:iCs/>
+        </w:rPr>
+      </w:pPr>
+    </w:p>
+    <w:p>
+      <w:pPr>
+        <w:spacing w:after="0" w:line="240" w:lineRule="auto"/>
+        <w:rPr>
+          <w:u w:val="single"/>
+        </w:rPr>
+      </w:pPr>
+      <w:r>
+        <w:rPr>
+          <w:u w:val="single"/>
+        </w:rPr>
+        <w:t xml:space="preserve">Processed data is files produced in </w:t>
       </w:r>
       <w:proofErr w:type="gramStart"/>
       <w:r>
-        <w:t>datacleaningall.R</w:t>
+        <w:rPr>
+          <w:u w:val="single"/>
+        </w:rPr>
+        <w:t>analysis</w:t>
       </w:r>
       <w:proofErr w:type="gramEnd"/>
       <w:r>
-        <w:t xml:space="preserve">: This file has </w:t>
-      </w:r>
-      <w:proofErr w:type="gramStart"/>
-      <w:r>
-        <w:t>all of</w:t>
-      </w:r>
-      <w:proofErr w:type="gramEnd"/>
-      <w:r>
-        <w:t xml:space="preserve"> the fixes to the data which were recorded in my lab notebook, issues with samples which were redone on a new plate etc. It also has the contamination correction in which I filter for the negative controls. This step is separated by year because 2024 (barcoding) and 2025 (metabarcoding) had different control plate set ups. </w:t>
-      </w:r>
-    </w:p>
-    <w:p>
-      <w:r>
-        <w:t>2_</w:t>
-      </w:r>
-      <w:proofErr w:type="gramStart"/>
-      <w:r>
-        <w:t>functions.R</w:t>
-      </w:r>
-      <w:proofErr w:type="gramEnd"/>
-      <w:r>
-        <w:t xml:space="preserve">: Has </w:t>
-      </w:r>
-      <w:proofErr w:type="gramStart"/>
-      <w:r>
-        <w:t>all of</w:t>
-      </w:r>
-      <w:proofErr w:type="gramEnd"/>
-      <w:r>
-        <w:t xml:space="preserve"> the functions needed for analysis in </w:t>
-      </w:r>
-      <w:proofErr w:type="gramStart"/>
-      <w:r>
-        <w:t>all of</w:t>
-      </w:r>
-      <w:proofErr w:type="gramEnd"/>
-      <w:r>
-        <w:t xml:space="preserve"> the subsequent scripts. </w:t>
-      </w:r>
-    </w:p>
-    <w:p>
-      <w:r>
-        <w:t xml:space="preserve">3_phylogenetic </w:t>
-      </w:r>
+        <w:rPr>
+          <w:u w:val="single"/>
+        </w:rPr>
+        <w:t xml:space="preserve"> but they may be used in later analysis:</w:t>
+      </w:r>
+    </w:p>
+    <w:p>
+      <w:pPr>
+        <w:spacing w:after="0" w:line="240" w:lineRule="auto"/>
+      </w:pPr>
+    </w:p>
+    <w:p>
+      <w:pPr>
+        <w:spacing w:after="0" w:line="240" w:lineRule="auto"/>
+      </w:pPr>
+      <w:r>
+        <w:t xml:space="preserve">Such as filtered sequence files from script file </w:t>
+      </w:r>
+      <w:r>
+        <w:t>1_Data_Cleaning.R</w:t>
+      </w:r>
+      <w:r>
+        <w:t>:</w:t>
+      </w:r>
+    </w:p>
+    <w:p>
+      <w:pPr>
+        <w:spacing w:after="0" w:line="240" w:lineRule="auto"/>
+        <w:rPr>
+          <w:i/>
+          <w:iCs/>
+        </w:rPr>
+      </w:pPr>
+      <w:r>
+        <w:rPr>
+          <w:i/>
+          <w:iCs/>
+        </w:rPr>
+        <w:t>KBIMP2024_filteredCOI.tsv</w:t>
+      </w:r>
+    </w:p>
+    <w:p>
+      <w:pPr>
+        <w:spacing w:after="0" w:line="240" w:lineRule="auto"/>
+        <w:rPr>
+          <w:i/>
+          <w:iCs/>
+        </w:rPr>
+      </w:pPr>
+      <w:r>
+        <w:rPr>
+          <w:i/>
+          <w:iCs/>
+        </w:rPr>
+        <w:t>KBIMP2025_filteredCOI.tsv</w:t>
+      </w:r>
+    </w:p>
+    <w:p>
+      <w:pPr>
+        <w:spacing w:after="0" w:line="240" w:lineRule="auto"/>
+        <w:rPr>
+          <w:i/>
+          <w:iCs/>
+        </w:rPr>
+      </w:pPr>
+    </w:p>
+    <w:p>
+      <w:pPr>
+        <w:spacing w:after="0" w:line="240" w:lineRule="auto"/>
+      </w:pPr>
+      <w:r>
+        <w:t>Unique sequence files which are used to get species from BOLD:</w:t>
+      </w:r>
+    </w:p>
+    <w:p>
+      <w:pPr>
+        <w:spacing w:after="0" w:line="240" w:lineRule="auto"/>
+        <w:rPr>
+          <w:i/>
+          <w:iCs/>
+        </w:rPr>
+      </w:pPr>
       <w:proofErr w:type="spellStart"/>
       <w:proofErr w:type="gramStart"/>
       <w:r>
-        <w:t>analysis.R</w:t>
+        <w:rPr>
+          <w:i/>
+          <w:iCs/>
+        </w:rPr>
+        <w:t>uniquemosseqforbold.fasta</w:t>
       </w:r>
       <w:proofErr w:type="spellEnd"/>
       <w:proofErr w:type="gramEnd"/>
-      <w:r>
-        <w:t>: This is the phylogenetic analysis (the building of tree and species assignments of ones which we did not assign using the probabilistic method) for 2024 samples. THIS USES THE MEDIOD METHOD.</w:t>
-      </w:r>
-    </w:p>
-    <w:p>
-      <w:r>
-        <w:t xml:space="preserve">4_phylogenetics 2025 </w:t>
-      </w:r>
+    </w:p>
+    <w:p>
+      <w:pPr>
+        <w:spacing w:after="0" w:line="240" w:lineRule="auto"/>
+        <w:rPr>
+          <w:i/>
+          <w:iCs/>
+        </w:rPr>
+      </w:pPr>
       <w:proofErr w:type="spellStart"/>
+      <w:r>
+        <w:rPr>
+          <w:i/>
+          <w:iCs/>
+        </w:rPr>
+        <w:t>unique_simseq_</w:t>
+      </w:r>
       <w:proofErr w:type="gramStart"/>
       <w:r>
-        <w:t>data.R</w:t>
+        <w:rPr>
+          <w:i/>
+          <w:iCs/>
+        </w:rPr>
+        <w:t>forbold.fasta</w:t>
       </w:r>
       <w:proofErr w:type="spellEnd"/>
       <w:proofErr w:type="gramEnd"/>
-      <w:r>
-        <w:t xml:space="preserve">: </w:t>
-      </w:r>
-      <w:r>
-        <w:t xml:space="preserve">This is the phylogenetic analysis (the building of tree and species assignments of ones which we </w:t>
-      </w:r>
-      <w:r>
-        <w:t>did not assign</w:t>
-      </w:r>
-      <w:r>
-        <w:t xml:space="preserve"> using the probabilistic method) for 202</w:t>
-      </w:r>
-      <w:r>
-        <w:t>5</w:t>
-      </w:r>
-      <w:r>
-        <w:t xml:space="preserve"> samples. THIS USES THE MEDIOD METHOD.</w:t>
-      </w:r>
-    </w:p>
-    <w:p>
-      <w:r>
-        <w:t xml:space="preserve">5_Phylogenetics unique </w:t>
-      </w:r>
+    </w:p>
+    <w:p>
+      <w:pPr>
+        <w:spacing w:after="0" w:line="240" w:lineRule="auto"/>
+        <w:rPr>
+          <w:i/>
+          <w:iCs/>
+        </w:rPr>
+      </w:pPr>
       <w:proofErr w:type="spellStart"/>
+      <w:r>
+        <w:rPr>
+          <w:i/>
+          <w:iCs/>
+        </w:rPr>
+        <w:t>unique_bfseq_</w:t>
+      </w:r>
       <w:proofErr w:type="gramStart"/>
       <w:r>
-        <w:t>sequences.R</w:t>
+        <w:rPr>
+          <w:i/>
+          <w:iCs/>
+        </w:rPr>
+        <w:t>forbold.fasta</w:t>
       </w:r>
       <w:proofErr w:type="spellEnd"/>
       <w:proofErr w:type="gramEnd"/>
-      <w:r>
-        <w:t xml:space="preserve">: </w:t>
-      </w:r>
-      <w:r>
-        <w:t xml:space="preserve">This is the phylogenetic analysis (the building of tree and species assignments of ones which we </w:t>
-      </w:r>
-      <w:r>
-        <w:t>did not assign</w:t>
-      </w:r>
-      <w:r>
-        <w:t xml:space="preserve"> using the probabilistic method) for </w:t>
-      </w:r>
-      <w:r>
-        <w:t xml:space="preserve">2024 and </w:t>
-      </w:r>
-      <w:r>
-        <w:t>2025 samples</w:t>
-      </w:r>
-      <w:r>
-        <w:t xml:space="preserve"> combined</w:t>
-      </w:r>
-      <w:r>
-        <w:t>.</w:t>
-      </w:r>
-      <w:r>
-        <w:t xml:space="preserve"> This uses unique sequences and has the BOLD files downloaded then brought into R. It also has the comparison of the two methods (from 3 and 4 above). </w:t>
-      </w:r>
-    </w:p>
-    <w:p>
-      <w:r>
-        <w:t xml:space="preserve">6_Ecological analysis </w:t>
+    </w:p>
+    <w:p>
+      <w:pPr>
+        <w:spacing w:after="0" w:line="240" w:lineRule="auto"/>
+        <w:rPr>
+          <w:i/>
+          <w:iCs/>
+        </w:rPr>
+      </w:pPr>
+    </w:p>
+    <w:p>
+      <w:pPr>
+        <w:spacing w:after="0" w:line="240" w:lineRule="auto"/>
+      </w:pPr>
+      <w:r>
+        <w:t xml:space="preserve">BOLD files from sequence searches </w:t>
+      </w:r>
+    </w:p>
+    <w:p>
+      <w:pPr>
+        <w:spacing w:after="0" w:line="240" w:lineRule="auto"/>
+        <w:rPr>
+          <w:i/>
+          <w:iCs/>
+        </w:rPr>
+      </w:pPr>
+      <w:r>
+        <w:rPr>
+          <w:i/>
+          <w:iCs/>
+        </w:rPr>
+        <w:t>BOLDaedescombined.csv</w:t>
+      </w:r>
+    </w:p>
+    <w:p>
+      <w:pPr>
+        <w:spacing w:after="0" w:line="240" w:lineRule="auto"/>
+        <w:rPr>
+          <w:i/>
+          <w:iCs/>
+        </w:rPr>
+      </w:pPr>
+      <w:r>
+        <w:rPr>
+          <w:i/>
+          <w:iCs/>
+        </w:rPr>
+        <w:t>BOLDID_simuulidae.csv</w:t>
+      </w:r>
+    </w:p>
+    <w:p>
+      <w:pPr>
+        <w:spacing w:after="0" w:line="240" w:lineRule="auto"/>
+        <w:rPr>
+          <w:i/>
+          <w:iCs/>
+        </w:rPr>
+      </w:pPr>
+      <w:r>
+        <w:rPr>
+          <w:i/>
+          <w:iCs/>
+        </w:rPr>
+        <w:t>BOLDID_notsimulidae.csv</w:t>
+      </w:r>
+    </w:p>
+    <w:p>
+      <w:pPr>
+        <w:spacing w:after="0" w:line="240" w:lineRule="auto"/>
+        <w:rPr>
+          <w:i/>
+          <w:iCs/>
+        </w:rPr>
+      </w:pPr>
+      <w:r>
+        <w:rPr>
+          <w:i/>
+          <w:iCs/>
+        </w:rPr>
+        <w:t>BOLDIDspecies.csv</w:t>
+      </w:r>
+      <w:r>
+        <w:rPr>
+          <w:i/>
+          <w:iCs/>
+        </w:rPr>
+        <w:t xml:space="preserve"> (which has </w:t>
+      </w:r>
+      <w:proofErr w:type="gramStart"/>
+      <w:r>
+        <w:rPr>
+          <w:i/>
+          <w:iCs/>
+        </w:rPr>
+        <w:t>all of</w:t>
+      </w:r>
+      <w:proofErr w:type="gramEnd"/>
+      <w:r>
+        <w:rPr>
+          <w:i/>
+          <w:iCs/>
+        </w:rPr>
+        <w:t xml:space="preserve"> the BOLDBIN codes and the species which they correspond to)</w:t>
+      </w:r>
+    </w:p>
+    <w:p>
+      <w:pPr>
+        <w:spacing w:after="0" w:line="240" w:lineRule="auto"/>
+        <w:rPr>
+          <w:i/>
+          <w:iCs/>
+        </w:rPr>
+      </w:pPr>
+    </w:p>
+    <w:p>
+      <w:pPr>
+        <w:spacing w:after="0" w:line="240" w:lineRule="auto"/>
+        <w:rPr>
+          <w:i/>
+          <w:iCs/>
+        </w:rPr>
+      </w:pPr>
+      <w:r>
+        <w:t>Final combined updated species file:</w:t>
+      </w:r>
+      <w:r>
+        <w:t xml:space="preserve"> </w:t>
       </w:r>
       <w:proofErr w:type="spellStart"/>
-      <w:proofErr w:type="gramStart"/>
-      <w:r>
-        <w:t>final.R</w:t>
+      <w:r>
+        <w:rPr>
+          <w:i/>
+          <w:iCs/>
+        </w:rPr>
+        <w:t>KBIMP_updatedspecies.tsv</w:t>
       </w:r>
       <w:proofErr w:type="spellEnd"/>
-      <w:proofErr w:type="gramEnd"/>
-      <w:r>
-        <w:t xml:space="preserve">: This has all the ecological analyses and most of the figure production. It has </w:t>
-      </w:r>
-      <w:proofErr w:type="spellStart"/>
-      <w:r>
-        <w:t>iNEXT</w:t>
-      </w:r>
-      <w:proofErr w:type="spellEnd"/>
-      <w:r>
-        <w:t xml:space="preserve">, comparison with 2012 data, species richness, NMDS, </w:t>
-      </w:r>
-      <w:proofErr w:type="spellStart"/>
-      <w:r>
-        <w:t>gbif</w:t>
-      </w:r>
-      <w:proofErr w:type="spellEnd"/>
-      <w:r>
-        <w:t xml:space="preserve"> map production, sample map production, temperature comparison plot. Sections are separated and labeled accordingly. </w:t>
-      </w:r>
+    </w:p>
+    <w:p>
+      <w:pPr>
+        <w:spacing w:after="0" w:line="240" w:lineRule="auto"/>
+        <w:rPr>
+          <w:i/>
+          <w:iCs/>
+        </w:rPr>
+      </w:pPr>
     </w:p>
     <w:sectPr>
       <w:pgSz w:w="12240" w:h="15840"/>

</xml_diff>